<commit_message>
Updated feature / fixed bug / added model
</commit_message>
<xml_diff>
--- a/backend.docx
+++ b/backend.docx
@@ -33,12 +33,37 @@
           <w:bCs/>
         </w:rPr>
       </w:pPr>
-      <w:r>
-        <w:rPr>
-          <w:b/>
-          <w:bCs/>
-        </w:rPr>
-        <w:t>admin@jansamadhan.ai / Admin@123</w:t>
+      <w:hyperlink r:id="rId5" w:history="1">
+        <w:r>
+          <w:rPr>
+            <w:rStyle w:val="Hyperlink"/>
+            <w:b/>
+            <w:bCs/>
+          </w:rPr>
+          <w:t>admin@jansamadhan.ai</w:t>
+        </w:r>
+      </w:hyperlink>
+      <w:r>
+        <w:rPr>
+          <w:b/>
+          <w:bCs/>
+        </w:rPr>
+        <w:t xml:space="preserve"> </w:t>
+      </w:r>
+    </w:p>
+    <w:p>
+      <w:pPr>
+        <w:rPr>
+          <w:b/>
+          <w:bCs/>
+        </w:rPr>
+      </w:pPr>
+      <w:r>
+        <w:rPr>
+          <w:b/>
+          <w:bCs/>
+        </w:rPr>
+        <w:t>Admin@123</w:t>
       </w:r>
     </w:p>
     <w:p>
@@ -117,7 +142,7 @@
     </w:p>
     <w:p>
       <w:r>
-        <w:pict>
+        <w:pict w14:anchorId="03B98D97">
           <v:rect id="_x0000_i1025" style="width:0;height:1.5pt" o:hralign="center" o:hrstd="t" o:hr="t" fillcolor="#a0a0a0" stroked="f"/>
         </w:pict>
       </w:r>
@@ -291,6 +316,9 @@
       </w:r>
       <w:r>
         <w:br/>
+      </w:r>
+      <w:r>
+        <w:lastRenderedPageBreak/>
         <w:t>role</w:t>
       </w:r>
       <w:r>
@@ -310,7 +338,6 @@
           <w:b/>
           <w:bCs/>
         </w:rPr>
-        <w:lastRenderedPageBreak/>
         <w:t>APIs</w:t>
       </w:r>
     </w:p>
@@ -410,7 +437,7 @@
     </w:p>
     <w:p>
       <w:r>
-        <w:pict>
+        <w:pict w14:anchorId="00798A43">
           <v:rect id="_x0000_i1026" style="width:0;height:1.5pt" o:hralign="center" o:hrstd="t" o:hr="t" fillcolor="#a0a0a0" stroked="f"/>
         </w:pict>
       </w:r>
@@ -696,7 +723,7 @@
     </w:p>
     <w:p>
       <w:r>
-        <w:pict>
+        <w:pict w14:anchorId="51B9ECDA">
           <v:rect id="_x0000_i1027" style="width:0;height:1.5pt" o:hralign="center" o:hrstd="t" o:hr="t" fillcolor="#a0a0a0" stroked="f"/>
         </w:pict>
       </w:r>
@@ -967,7 +994,7 @@
     <w:p>
       <w:r>
         <w:lastRenderedPageBreak/>
-        <w:pict>
+        <w:pict w14:anchorId="64C05018">
           <v:rect id="_x0000_i1028" style="width:0;height:1.5pt" o:hralign="center" o:hrstd="t" o:hr="t" fillcolor="#a0a0a0" stroked="f"/>
         </w:pict>
       </w:r>
@@ -1204,7 +1231,7 @@
     </w:p>
     <w:p>
       <w:r>
-        <w:pict>
+        <w:pict w14:anchorId="40CD9969">
           <v:rect id="_x0000_i1029" style="width:0;height:1.5pt" o:hralign="center" o:hrstd="t" o:hr="t" fillcolor="#a0a0a0" stroked="f"/>
         </w:pict>
       </w:r>
@@ -1429,7 +1456,7 @@
     </w:p>
     <w:p>
       <w:r>
-        <w:pict>
+        <w:pict w14:anchorId="2A83322E">
           <v:rect id="_x0000_i1030" style="width:0;height:1.5pt" o:hralign="center" o:hrstd="t" o:hr="t" fillcolor="#a0a0a0" stroked="f"/>
         </w:pict>
       </w:r>
@@ -1653,7 +1680,7 @@
     </w:p>
     <w:p>
       <w:r>
-        <w:pict>
+        <w:pict w14:anchorId="0628CACF">
           <v:rect id="_x0000_i1031" style="width:0;height:1.5pt" o:hralign="center" o:hrstd="t" o:hr="t" fillcolor="#a0a0a0" stroked="f"/>
         </w:pict>
       </w:r>
@@ -1914,7 +1941,7 @@
     </w:p>
     <w:p>
       <w:r>
-        <w:pict>
+        <w:pict w14:anchorId="65F90E3C">
           <v:rect id="_x0000_i1032" style="width:0;height:1.5pt" o:hralign="center" o:hrstd="t" o:hr="t" fillcolor="#a0a0a0" stroked="f"/>
         </w:pict>
       </w:r>
@@ -2021,7 +2048,7 @@
     </w:p>
     <w:p>
       <w:r>
-        <w:pict>
+        <w:pict w14:anchorId="1EA405FD">
           <v:rect id="_x0000_i1033" style="width:0;height:1.5pt" o:hralign="center" o:hrstd="t" o:hr="t" fillcolor="#a0a0a0" stroked="f"/>
         </w:pict>
       </w:r>
@@ -2171,7 +2198,7 @@
     </w:p>
     <w:p>
       <w:r>
-        <w:pict>
+        <w:pict w14:anchorId="15868DDC">
           <v:rect id="_x0000_i1034" style="width:0;height:1.5pt" o:hralign="center" o:hrstd="t" o:hr="t" fillcolor="#a0a0a0" stroked="f"/>
         </w:pict>
       </w:r>
@@ -3779,6 +3806,7 @@
   <w:style w:type="character" w:default="1" w:styleId="DefaultParagraphFont">
     <w:name w:val="Default Paragraph Font"/>
     <w:uiPriority w:val="1"/>
+    <w:semiHidden/>
     <w:unhideWhenUsed/>
   </w:style>
   <w:style w:type="table" w:default="1" w:styleId="TableNormal">
@@ -4092,6 +4120,29 @@
       <w:spacing w:val="5"/>
     </w:rPr>
   </w:style>
+  <w:style w:type="character" w:styleId="Hyperlink">
+    <w:name w:val="Hyperlink"/>
+    <w:basedOn w:val="DefaultParagraphFont"/>
+    <w:uiPriority w:val="99"/>
+    <w:unhideWhenUsed/>
+    <w:rsid w:val="002F625C"/>
+    <w:rPr>
+      <w:color w:val="0563C1" w:themeColor="hyperlink"/>
+      <w:u w:val="single"/>
+    </w:rPr>
+  </w:style>
+  <w:style w:type="character" w:styleId="UnresolvedMention">
+    <w:name w:val="Unresolved Mention"/>
+    <w:basedOn w:val="DefaultParagraphFont"/>
+    <w:uiPriority w:val="99"/>
+    <w:semiHidden/>
+    <w:unhideWhenUsed/>
+    <w:rsid w:val="002F625C"/>
+    <w:rPr>
+      <w:color w:val="605E5C"/>
+      <w:shd w:val="clear" w:color="auto" w:fill="E1DFDD"/>
+    </w:rPr>
+  </w:style>
 </w:styles>
 </file>
 

</xml_diff>